<commit_message>
Add Christopher Bartonjo to the group members
Added member 17 (Christopher Bartonjo, ST62/60293/2025) to the members page in
every module notebook and to the Module 10 README, then regenerated all five
Word docs and rebuilt the Module 10 submission zip.
</commit_message>
<xml_diff>
--- a/final-submissions/Module_10_NP_Completeness.docx
+++ b/final-submissions/Module_10_NP_Completeness.docx
@@ -626,6 +626,41 @@
             </w:pPr>
             <w:r>
               <w:t xml:space="preserve">ST62/56881/2025</w:t>
+            </w:r>
+          </w:p>
+        </w:tc>
+      </w:tr>
+      <w:tr>
+        <w:tc>
+          <w:tcPr/>
+          <w:p>
+            <w:pPr>
+              <w:pStyle w:val="Compact"/>
+            </w:pPr>
+            <w:r>
+              <w:t xml:space="preserve">17</w:t>
+            </w:r>
+          </w:p>
+        </w:tc>
+        <w:tc>
+          <w:tcPr/>
+          <w:p>
+            <w:pPr>
+              <w:pStyle w:val="Compact"/>
+            </w:pPr>
+            <w:r>
+              <w:t xml:space="preserve">Christopher Bartonjo</w:t>
+            </w:r>
+          </w:p>
+        </w:tc>
+        <w:tc>
+          <w:tcPr/>
+          <w:p>
+            <w:pPr>
+              <w:pStyle w:val="Compact"/>
+            </w:pPr>
+            <w:r>
+              <w:t xml:space="preserve">ST62/60293/2025</w:t>
             </w:r>
           </w:p>
         </w:tc>

</xml_diff>